<commit_message>
Add published AI/BI dashboard on the new dataset
- dashboard/medical_omnichannel_intelligence.lvdash.json (6 datasets, 16 widgets),
  built + published on _sa701.moa gold tables; every query validated first
- evidence/10_aibi_dashboard.md captures deploy result + validated dataset outputs
- README + decisions doc + Word solution overview updated to include the dashboard

Co-authored-by: Isaac <no-reply@databricks.com>
</commit_message>
<xml_diff>
--- a/docs/Medical_Omnichannel_Daiichi_Solution_Overview.docx
+++ b/docs/Medical_Omnichannel_Daiichi_Solution_Overview.docx
@@ -530,6 +530,28 @@
           </w:tcPr>
           <w:p>
             <w:r>
+              <w:t>AI/BI dashboard</w:t>
+            </w:r>
+          </w:p>
+        </w:tc>
+        <w:tc>
+          <w:tcPr>
+            <w:tcW w:type="dxa" w:w="4320"/>
+          </w:tcPr>
+          <w:p>
+            <w:r>
+              <w:t>Medical Omnichannel Intelligence — Daiichi Sankyo (01f1b9f6cf2119cdb68bbd5df75d577e)</w:t>
+            </w:r>
+          </w:p>
+        </w:tc>
+      </w:tr>
+      <w:tr>
+        <w:tc>
+          <w:tcPr>
+            <w:tcW w:type="dxa" w:w="4320"/>
+          </w:tcPr>
+          <w:p>
+            <w:r>
               <w:t>GitHub repo</w:t>
             </w:r>
           </w:p>
@@ -695,6 +717,14 @@
       </w:pPr>
       <w:r>
         <w:t>Medical Engagement Copilot app (app/app.py, backend.py, app.yaml, requirements.txt): MSL Action Queue tab (Lakebase) + HCP Pre-Engagement tab (360 + AI briefing + write-back)</w:t>
+      </w:r>
+    </w:p>
+    <w:p>
+      <w:pPr>
+        <w:pStyle w:val="ListBullet"/>
+      </w:pPr>
+      <w:r>
+        <w:t>AI/BI dashboard 'Medical Omnichannel Intelligence — Daiichi Sankyo' (dashboard/medical_omnichannel_intelligence.lvdash.json, published): 6 KPI counters, reach-by-territory, priority-tier pie, topic-interest bar, overdue-by-product bar, next-best-engagement table</w:t>
       </w:r>
     </w:p>
     <w:p>

</xml_diff>